<commit_message>
To Display 10 data inside Data Table
</commit_message>
<xml_diff>
--- a/document/ownerhip_device.docx
+++ b/document/ownerhip_device.docx
@@ -3,14 +3,30 @@
 <w:document xmlns:wpc="http://schemas.microsoft.com/office/word/2010/wordprocessingCanvas" xmlns:cx="http://schemas.microsoft.com/office/drawing/2014/chartex" xmlns:cx1="http://schemas.microsoft.com/office/drawing/2015/9/8/chartex" xmlns:cx2="http://schemas.microsoft.com/office/drawing/2015/10/21/chartex" xmlns:cx3="http://schemas.microsoft.com/office/drawing/2016/5/9/chartex" xmlns:cx4="http://schemas.microsoft.com/office/drawing/2016/5/10/chartex" xmlns:cx5="http://schemas.microsoft.com/office/drawing/2016/5/11/chartex" xmlns:cx6="http://schemas.microsoft.com/office/drawing/2016/5/12/chartex" xmlns:cx7="http://schemas.microsoft.com/office/drawing/2016/5/13/chartex" xmlns:cx8="http://schemas.microsoft.com/office/drawing/2016/5/14/chartex" xmlns:mc="http://schemas.openxmlformats.org/markup-compatibility/2006" xmlns:aink="http://schemas.microsoft.com/office/drawing/2016/ink" xmlns:am3d="http://schemas.microsoft.com/office/drawing/2017/model3d" xmlns:o="urn:schemas-microsoft-com:office:office" xmlns:oel="http://schemas.microsoft.com/office/2019/extlst" xmlns:r="http://schemas.openxmlformats.org/officeDocument/2006/relationships" xmlns:m="http://schemas.openxmlformats.org/officeDocument/2006/math" xmlns:v="urn:schemas-microsoft-com:vml" xmlns:wp14="http://schemas.microsoft.com/office/word/2010/wordprocessingDrawing" xmlns:wp="http://schemas.openxmlformats.org/drawingml/2006/wordprocessingDrawing" xmlns:w10="urn:schemas-microsoft-com:office:word" xmlns:w="http://schemas.openxmlformats.org/wordprocessingml/2006/main" xmlns:w14="http://schemas.microsoft.com/office/word/2010/wordml" xmlns:w15="http://schemas.microsoft.com/office/word/2012/wordml" xmlns:w16cex="http://schemas.microsoft.com/office/word/2018/wordml/cex" xmlns:w16cid="http://schemas.microsoft.com/office/word/2016/wordml/cid" xmlns:w16="http://schemas.microsoft.com/office/word/2018/wordml" xmlns:w16du="http://schemas.microsoft.com/office/word/2023/wordml/word16du" xmlns:w16sdtdh="http://schemas.microsoft.com/office/word/2020/wordml/sdtdatahash" xmlns:w16sdtfl="http://schemas.microsoft.com/office/word/2024/wordml/sdtformatlock" xmlns:w16se="http://schemas.microsoft.com/office/word/2015/wordml/symex" xmlns:wpg="http://schemas.microsoft.com/office/word/2010/wordprocessingGroup" xmlns:wpi="http://schemas.microsoft.com/office/word/2010/wordprocessingInk" xmlns:wne="http://schemas.microsoft.com/office/word/2006/wordml" xmlns:wps="http://schemas.microsoft.com/office/word/2010/wordprocessingShape" mc:Ignorable="w14 w15 w16se w16cid w16 w16cex w16sdtdh w16sdtfl w16du wp14">
   <w:body>
     <w:p>
-      <w:hyperlink r:id="rId4" w:history="1">
-        <w:r>
-          <w:rPr>
-            <w:rStyle w:val="Hyperlink"/>
-          </w:rPr>
-          <w:t>https://chatgpt.com/c/6a29381f-0528-83a4-a117-fa1ece38f4ab</w:t>
-        </w:r>
-      </w:hyperlink>
+      <w:r>
+        <w:fldChar w:fldCharType="begin"/>
+      </w:r>
+      <w:r>
+        <w:instrText>HYPERLINK "</w:instrText>
+      </w:r>
+      <w:r>
+        <w:instrText>https://chatgpt.com/c/6a29381f-0528-83a4-a117-fa1ece38f4ab</w:instrText>
+      </w:r>
+      <w:r>
+        <w:instrText>"</w:instrText>
+      </w:r>
+      <w:r>
+        <w:fldChar w:fldCharType="separate"/>
+      </w:r>
+      <w:r>
+        <w:rPr>
+          <w:rStyle w:val="Hyperlink"/>
+        </w:rPr>
+        <w:t>https://chatgpt.com/c/6a29381f-0528-83a4-a117-fa1ece38f4ab</w:t>
+      </w:r>
+      <w:r>
+        <w:fldChar w:fldCharType="end"/>
+      </w:r>
     </w:p>
     <w:p/>
     <w:p>
@@ -57,7 +73,15 @@
         <w:t>এ</w:t>
       </w:r>
       <w:r>
-        <w:t xml:space="preserve"> already central api.get() client </w:t>
+        <w:t xml:space="preserve"> already central </w:t>
+      </w:r>
+      <w:proofErr w:type="gramStart"/>
+      <w:r>
+        <w:t>api.get(</w:t>
+      </w:r>
+      <w:proofErr w:type="gramEnd"/>
+      <w:r>
+        <w:t xml:space="preserve">) client </w:t>
       </w:r>
       <w:r>
         <w:rPr>
@@ -75,7 +99,15 @@
       </w:r>
       <w:r>
         <w:br/>
-        <w:t xml:space="preserve">    process.env.NEXT_PUBLIC_API_URL ??</w:t>
+        <w:t xml:space="preserve">    </w:t>
+      </w:r>
+      <w:proofErr w:type="gramStart"/>
+      <w:r>
+        <w:t>process.env.NEXT</w:t>
+      </w:r>
+      <w:proofErr w:type="gramEnd"/>
+      <w:r>
+        <w:t>_PUBLIC_API_URL ??</w:t>
       </w:r>
       <w:r>
         <w:br/>
@@ -90,18 +122,39 @@
     <w:p/>
     <w:p/>
     <w:p>
-      <w:r>
-        <w:t>SUM(CASE WHEN owst_category = 1 THEN 1 ELSE 0 END) AS user_ownership,</w:t>
-      </w:r>
-    </w:p>
-    <w:p>
-      <w:r>
-        <w:t xml:space="preserve">    SUM(CASE WHEN owst_category = 2 THEN 1 ELSE 0 END) AS vendor_ownership,</w:t>
-      </w:r>
-    </w:p>
-    <w:p>
-      <w:r>
-        <w:t xml:space="preserve">    SUM(CASE WHEN owst_category IN (1, 2) THEN 1 ELSE 0 END) AS total_ownership</w:t>
+      <w:proofErr w:type="gramStart"/>
+      <w:r>
+        <w:t>SUM(</w:t>
+      </w:r>
+      <w:proofErr w:type="gramEnd"/>
+      <w:r>
+        <w:t>CASE WHEN owst_category = 1 THEN 1 ELSE 0 END) AS user_ownership,</w:t>
+      </w:r>
+    </w:p>
+    <w:p>
+      <w:r>
+        <w:t xml:space="preserve">    </w:t>
+      </w:r>
+      <w:proofErr w:type="gramStart"/>
+      <w:r>
+        <w:t>SUM(</w:t>
+      </w:r>
+      <w:proofErr w:type="gramEnd"/>
+      <w:r>
+        <w:t>CASE WHEN owst_category = 2 THEN 1 ELSE 0 END) AS vendor_ownership,</w:t>
+      </w:r>
+    </w:p>
+    <w:p>
+      <w:r>
+        <w:t xml:space="preserve">    </w:t>
+      </w:r>
+      <w:proofErr w:type="gramStart"/>
+      <w:r>
+        <w:t>SUM(</w:t>
+      </w:r>
+      <w:proofErr w:type="gramEnd"/>
+      <w:r>
+        <w:t>CASE WHEN owst_category IN (1, 2) THEN 1 ELSE 0 END) AS total_ownership</w:t>
       </w:r>
     </w:p>
     <w:p>
@@ -126,7 +179,21 @@
         <w:rPr>
           <w:color w:val="4472C4" w:themeColor="accent1"/>
         </w:rPr>
-        <w:t>user_ownership : 58</w:t>
+        <w:t>user_</w:t>
+      </w:r>
+      <w:proofErr w:type="gramStart"/>
+      <w:r>
+        <w:rPr>
+          <w:color w:val="4472C4" w:themeColor="accent1"/>
+        </w:rPr>
+        <w:t>ownership :</w:t>
+      </w:r>
+      <w:proofErr w:type="gramEnd"/>
+      <w:r>
+        <w:rPr>
+          <w:color w:val="4472C4" w:themeColor="accent1"/>
+        </w:rPr>
+        <w:t xml:space="preserve"> 58</w:t>
       </w:r>
     </w:p>
     <w:p>
@@ -139,7 +206,21 @@
         <w:rPr>
           <w:color w:val="4472C4" w:themeColor="accent1"/>
         </w:rPr>
-        <w:t>vendor_ownership : 119</w:t>
+        <w:t>vendor_</w:t>
+      </w:r>
+      <w:proofErr w:type="gramStart"/>
+      <w:r>
+        <w:rPr>
+          <w:color w:val="4472C4" w:themeColor="accent1"/>
+        </w:rPr>
+        <w:t>ownership :</w:t>
+      </w:r>
+      <w:proofErr w:type="gramEnd"/>
+      <w:r>
+        <w:rPr>
+          <w:color w:val="4472C4" w:themeColor="accent1"/>
+        </w:rPr>
+        <w:t xml:space="preserve"> 119</w:t>
       </w:r>
     </w:p>
     <w:p>
@@ -152,7 +233,21 @@
         <w:rPr>
           <w:color w:val="4472C4" w:themeColor="accent1"/>
         </w:rPr>
-        <w:t>total_ownership : 177</w:t>
+        <w:t>total_</w:t>
+      </w:r>
+      <w:proofErr w:type="gramStart"/>
+      <w:r>
+        <w:rPr>
+          <w:color w:val="4472C4" w:themeColor="accent1"/>
+        </w:rPr>
+        <w:t>ownership :</w:t>
+      </w:r>
+      <w:proofErr w:type="gramEnd"/>
+      <w:r>
+        <w:rPr>
+          <w:color w:val="4472C4" w:themeColor="accent1"/>
+        </w:rPr>
+        <w:t xml:space="preserve"> 177</w:t>
       </w:r>
     </w:p>
     <w:p/>
@@ -178,7 +273,7 @@
                     <pic:cNvPicPr/>
                   </pic:nvPicPr>
                   <pic:blipFill>
-                    <a:blip r:embed="rId5"/>
+                    <a:blip r:embed="rId4"/>
                     <a:stretch>
                       <a:fillRect/>
                     </a:stretch>
@@ -236,22 +331,54 @@
     </w:p>
     <w:p>
       <w:r>
-        <w:t xml:space="preserve">    COUNT(*) FILTER (WHERE owst_category = 1) AS user_ownership,</w:t>
-      </w:r>
-    </w:p>
-    <w:p>
-      <w:r>
-        <w:t xml:space="preserve">    COUNT(*) FILTER (WHERE owst_category = 2) AS vendor_ownership,</w:t>
-      </w:r>
-    </w:p>
-    <w:p>
-      <w:r>
-        <w:t xml:space="preserve">    COUNT(*) FILTER (WHERE owst_category IN (1, 2)) AS total_ownership</w:t>
-      </w:r>
-    </w:p>
-    <w:p>
-      <w:r>
-        <w:t>FROM public.ownership_transfers;</w:t>
+        <w:t xml:space="preserve">    </w:t>
+      </w:r>
+      <w:proofErr w:type="gramStart"/>
+      <w:r>
+        <w:t>COUNT(</w:t>
+      </w:r>
+      <w:proofErr w:type="gramEnd"/>
+      <w:r>
+        <w:t>*) FILTER (WHERE owst_category = 1) AS user_ownership,</w:t>
+      </w:r>
+    </w:p>
+    <w:p>
+      <w:r>
+        <w:t xml:space="preserve">    </w:t>
+      </w:r>
+      <w:proofErr w:type="gramStart"/>
+      <w:r>
+        <w:t>COUNT(</w:t>
+      </w:r>
+      <w:proofErr w:type="gramEnd"/>
+      <w:r>
+        <w:t>*) FILTER (WHERE owst_category = 2) AS vendor_ownership,</w:t>
+      </w:r>
+    </w:p>
+    <w:p>
+      <w:r>
+        <w:t xml:space="preserve">    </w:t>
+      </w:r>
+      <w:proofErr w:type="gramStart"/>
+      <w:r>
+        <w:t>COUNT(</w:t>
+      </w:r>
+      <w:proofErr w:type="gramEnd"/>
+      <w:r>
+        <w:t>*) FILTER (WHERE owst_category IN (1, 2)) AS total_ownership</w:t>
+      </w:r>
+    </w:p>
+    <w:p>
+      <w:r>
+        <w:t xml:space="preserve">FROM </w:t>
+      </w:r>
+      <w:proofErr w:type="gramStart"/>
+      <w:r>
+        <w:t>public.ownership</w:t>
+      </w:r>
+      <w:proofErr w:type="gramEnd"/>
+      <w:r>
+        <w:t>_transfers;</w:t>
       </w:r>
     </w:p>
     <w:p/>
@@ -362,11 +489,27 @@
       </w:r>
       <w:r>
         <w:br/>
-        <w:t xml:space="preserve">    COUNT(*) AS total</w:t>
-      </w:r>
-      <w:r>
-        <w:br/>
-        <w:t>FROM public.ownership_transfers</w:t>
+        <w:t xml:space="preserve">    </w:t>
+      </w:r>
+      <w:proofErr w:type="gramStart"/>
+      <w:r>
+        <w:t>COUNT(</w:t>
+      </w:r>
+      <w:proofErr w:type="gramEnd"/>
+      <w:r>
+        <w:t>*) AS total</w:t>
+      </w:r>
+      <w:r>
+        <w:br/>
+        <w:t xml:space="preserve">FROM </w:t>
+      </w:r>
+      <w:proofErr w:type="gramStart"/>
+      <w:r>
+        <w:t>public.ownership</w:t>
+      </w:r>
+      <w:proofErr w:type="gramEnd"/>
+      <w:r>
+        <w:t>_transfers</w:t>
       </w:r>
       <w:r>
         <w:br/>
@@ -392,7 +535,15 @@
       </w:r>
       <w:r>
         <w:br/>
-        <w:t>Vendor Ownership  | 119</w:t>
+        <w:t xml:space="preserve">Vendor </w:t>
+      </w:r>
+      <w:proofErr w:type="gramStart"/>
+      <w:r>
+        <w:t>Ownership  |</w:t>
+      </w:r>
+      <w:proofErr w:type="gramEnd"/>
+      <w:r>
+        <w:t xml:space="preserve"> 119</w:t>
       </w:r>
     </w:p>
     <w:p>
@@ -459,7 +610,15 @@
       </w:r>
       <w:r>
         <w:br/>
-        <w:t>FROM public.asset_devices</w:t>
+        <w:t xml:space="preserve">FROM </w:t>
+      </w:r>
+      <w:proofErr w:type="gramStart"/>
+      <w:r>
+        <w:t>public.asset</w:t>
+      </w:r>
+      <w:proofErr w:type="gramEnd"/>
+      <w:r>
+        <w:t>_devices</w:t>
       </w:r>
       <w:r>
         <w:br/>
@@ -491,7 +650,15 @@
     </w:p>
     <w:p>
       <w:r>
-        <w:t>But ownership_transfers is the actual ownership-transfer source table. Before changing the dashboard total from 168 to 177, check whether the same device appears in both places. Otherwise you may double-count ownership records.</w:t>
+        <w:t xml:space="preserve">But ownership_transfers is the actual ownership-transfer source table. Before changing the dashboard total from 168 to 177, check whether the same device appears in both places. </w:t>
+      </w:r>
+      <w:proofErr w:type="gramStart"/>
+      <w:r>
+        <w:t>Otherwise</w:t>
+      </w:r>
+      <w:proofErr w:type="gramEnd"/>
+      <w:r>
+        <w:t xml:space="preserve"> you may double-count ownership records.</w:t>
       </w:r>
     </w:p>
     <w:p>
@@ -509,11 +676,27 @@
       </w:r>
       <w:r>
         <w:br/>
-        <w:t xml:space="preserve">    COUNT(*) AS total</w:t>
-      </w:r>
-      <w:r>
-        <w:br/>
-        <w:t>FROM public.ownership_transfers</w:t>
+        <w:t xml:space="preserve">    </w:t>
+      </w:r>
+      <w:proofErr w:type="gramStart"/>
+      <w:r>
+        <w:t>COUNT(</w:t>
+      </w:r>
+      <w:proofErr w:type="gramEnd"/>
+      <w:r>
+        <w:t>*) AS total</w:t>
+      </w:r>
+      <w:r>
+        <w:br/>
+        <w:t xml:space="preserve">FROM </w:t>
+      </w:r>
+      <w:proofErr w:type="gramStart"/>
+      <w:r>
+        <w:t>public.ownership</w:t>
+      </w:r>
+      <w:proofErr w:type="gramEnd"/>
+      <w:r>
+        <w:t>_transfers</w:t>
       </w:r>
       <w:r>
         <w:br/>
@@ -555,7 +738,7 @@
                     <pic:cNvPicPr/>
                   </pic:nvPicPr>
                   <pic:blipFill>
-                    <a:blip r:embed="rId6"/>
+                    <a:blip r:embed="rId5"/>
                     <a:stretch>
                       <a:fillRect/>
                     </a:stretch>
@@ -605,7 +788,15 @@
     </w:p>
     <w:p>
       <w:r>
-        <w:t>1. Backend API from public.ownership_transfers</w:t>
+        <w:t xml:space="preserve">1. Backend API from </w:t>
+      </w:r>
+      <w:proofErr w:type="gramStart"/>
+      <w:r>
+        <w:t>public.ownership</w:t>
+      </w:r>
+      <w:proofErr w:type="gramEnd"/>
+      <w:r>
+        <w:t>_transfers</w:t>
       </w:r>
       <w:r>
         <w:br/>
@@ -613,12 +804,28 @@
       </w:r>
       <w:r>
         <w:br/>
-        <w:t>3. Replace mock ownership[] data in ownership-assets page</w:t>
-      </w:r>
-    </w:p>
-    <w:p>
-      <w:r>
-        <w:t xml:space="preserve">Your uploaded asset_device.go already has the correct handler structure and pgxpool database access, so we can add the ownership API there or create a separate handler later. </w:t>
+        <w:t xml:space="preserve">3. Replace mock </w:t>
+      </w:r>
+      <w:proofErr w:type="gramStart"/>
+      <w:r>
+        <w:t>ownership[</w:t>
+      </w:r>
+      <w:proofErr w:type="gramEnd"/>
+      <w:r>
+        <w:t>] data in ownership-assets page</w:t>
+      </w:r>
+    </w:p>
+    <w:p>
+      <w:r>
+        <w:t>Your uploaded asset_</w:t>
+      </w:r>
+      <w:proofErr w:type="gramStart"/>
+      <w:r>
+        <w:t>device.go</w:t>
+      </w:r>
+      <w:proofErr w:type="gramEnd"/>
+      <w:r>
+        <w:t xml:space="preserve"> already has the correct handler structure and pgxpool database access, so we can add the ownership API there or create a separate handler later. </w:t>
       </w:r>
     </w:p>
     <w:p>
@@ -655,8 +862,13 @@
       </w:r>
       <w:r>
         <w:br/>
-        <w:t>FROM information_schema.columns</w:t>
-      </w:r>
+        <w:t>FROM information_</w:t>
+      </w:r>
+      <w:proofErr w:type="gramStart"/>
+      <w:r>
+        <w:t>schema.columns</w:t>
+      </w:r>
+      <w:proofErr w:type="gramEnd"/>
       <w:r>
         <w:br/>
       </w:r>
@@ -684,7 +896,15 @@
       </w:r>
       <w:r>
         <w:br/>
-        <w:t>FROM public.ownership_transfers</w:t>
+        <w:t xml:space="preserve">FROM </w:t>
+      </w:r>
+      <w:proofErr w:type="gramStart"/>
+      <w:r>
+        <w:t>public.ownership</w:t>
+      </w:r>
+      <w:proofErr w:type="gramEnd"/>
+      <w:r>
+        <w:t>_transfers</w:t>
       </w:r>
       <w:r>
         <w:br/>
@@ -711,8 +931,13 @@
     </w:p>
     <w:p>
       <w:r>
-        <w:t>backend/internal/handler/ownership_transfer.go</w:t>
-      </w:r>
+        <w:t>backend/internal/handler/ownership_</w:t>
+      </w:r>
+      <w:proofErr w:type="gramStart"/>
+      <w:r>
+        <w:t>transfer.go</w:t>
+      </w:r>
+      <w:proofErr w:type="gramEnd"/>
     </w:p>
     <w:p>
       <w:r>
@@ -743,7 +968,15 @@
     </w:p>
     <w:p>
       <w:r>
-        <w:t>const ownership: Claim[] = [</w:t>
+        <w:t xml:space="preserve">const ownership: </w:t>
+      </w:r>
+      <w:proofErr w:type="gramStart"/>
+      <w:r>
+        <w:t>Claim[</w:t>
+      </w:r>
+      <w:proofErr w:type="gramEnd"/>
+      <w:r>
+        <w:t>] = [</w:t>
       </w:r>
       <w:r>
         <w:br/>
@@ -761,7 +994,15 @@
     </w:p>
     <w:p>
       <w:r>
-        <w:t>Total Ownership  → 177</w:t>
+        <w:t xml:space="preserve">Total </w:t>
+      </w:r>
+      <w:proofErr w:type="gramStart"/>
+      <w:r>
+        <w:t>Ownership  →</w:t>
+      </w:r>
+      <w:proofErr w:type="gramEnd"/>
+      <w:r>
+        <w:t xml:space="preserve"> 177</w:t>
       </w:r>
       <w:r>
         <w:br/>
@@ -802,7 +1043,15 @@
         <w:t>এ</w:t>
       </w:r>
       <w:r>
-        <w:t xml:space="preserve"> already central api.get() client </w:t>
+        <w:t xml:space="preserve"> already central </w:t>
+      </w:r>
+      <w:proofErr w:type="gramStart"/>
+      <w:r>
+        <w:t>api.get(</w:t>
+      </w:r>
+      <w:proofErr w:type="gramEnd"/>
+      <w:r>
+        <w:t xml:space="preserve">) client </w:t>
       </w:r>
       <w:r>
         <w:rPr>
@@ -820,7 +1069,15 @@
       </w:r>
       <w:r>
         <w:br/>
-        <w:t xml:space="preserve">    process.env.NEXT_PUBLIC_API_URL ??</w:t>
+        <w:t xml:space="preserve">    </w:t>
+      </w:r>
+      <w:proofErr w:type="gramStart"/>
+      <w:r>
+        <w:t>process.env.NEXT</w:t>
+      </w:r>
+      <w:proofErr w:type="gramEnd"/>
+      <w:r>
+        <w:t>_PUBLIC_API_URL ??</w:t>
       </w:r>
       <w:r>
         <w:br/>
@@ -828,8 +1085,13 @@
       </w:r>
     </w:p>
     <w:p>
-      <w:r>
-        <w:t>So ownership page-</w:t>
+      <w:proofErr w:type="gramStart"/>
+      <w:r>
+        <w:t>So</w:t>
+      </w:r>
+      <w:proofErr w:type="gramEnd"/>
+      <w:r>
+        <w:t xml:space="preserve"> ownership page-</w:t>
       </w:r>
       <w:r>
         <w:rPr>
@@ -838,7 +1100,15 @@
         <w:t>এ</w:t>
       </w:r>
       <w:r>
-        <w:t xml:space="preserve"> direct fetch() </w:t>
+        <w:t xml:space="preserve"> direct </w:t>
+      </w:r>
+      <w:proofErr w:type="gramStart"/>
+      <w:r>
+        <w:t>fetch(</w:t>
+      </w:r>
+      <w:proofErr w:type="gramEnd"/>
+      <w:r>
+        <w:t xml:space="preserve">) </w:t>
       </w:r>
       <w:r>
         <w:rPr>
@@ -856,7 +1126,15 @@
         <w:t>না</w:t>
       </w:r>
       <w:r>
-        <w:t xml:space="preserve">. We will use the same api.get() pattern that your dashboard and report APIs already use. </w:t>
+        <w:t xml:space="preserve">. We will use the same </w:t>
+      </w:r>
+      <w:proofErr w:type="gramStart"/>
+      <w:r>
+        <w:t>api.get(</w:t>
+      </w:r>
+      <w:proofErr w:type="gramEnd"/>
+      <w:r>
+        <w:t xml:space="preserve">) pattern that your dashboard and report APIs already use. </w:t>
       </w:r>
     </w:p>
     <w:p>
@@ -885,35 +1163,99 @@
       </w:r>
       <w:r>
         <w:br/>
-        <w:t xml:space="preserve">    list: (params?: {</w:t>
-      </w:r>
-      <w:r>
-        <w:br/>
-        <w:t xml:space="preserve">        page?: number;</w:t>
-      </w:r>
-      <w:r>
-        <w:br/>
-        <w:t xml:space="preserve">        limit?: number;</w:t>
-      </w:r>
-      <w:r>
-        <w:br/>
-        <w:t xml:space="preserve">        category?: string;</w:t>
-      </w:r>
-      <w:r>
-        <w:br/>
-        <w:t xml:space="preserve">        status?: number;</w:t>
-      </w:r>
-      <w:r>
-        <w:br/>
-        <w:t xml:space="preserve">        vendor_id?: number;</w:t>
-      </w:r>
-      <w:r>
-        <w:br/>
-        <w:t xml:space="preserve">        search?: string;</w:t>
-      </w:r>
-      <w:r>
-        <w:br/>
-        <w:t xml:space="preserve">    }) =&gt; {</w:t>
+        <w:t xml:space="preserve">    list: (</w:t>
+      </w:r>
+      <w:proofErr w:type="gramStart"/>
+      <w:r>
+        <w:t>params?:</w:t>
+      </w:r>
+      <w:proofErr w:type="gramEnd"/>
+      <w:r>
+        <w:t xml:space="preserve"> {</w:t>
+      </w:r>
+      <w:r>
+        <w:br/>
+        <w:t xml:space="preserve">        </w:t>
+      </w:r>
+      <w:proofErr w:type="gramStart"/>
+      <w:r>
+        <w:t>page?:</w:t>
+      </w:r>
+      <w:proofErr w:type="gramEnd"/>
+      <w:r>
+        <w:t xml:space="preserve"> number;</w:t>
+      </w:r>
+      <w:r>
+        <w:br/>
+        <w:t xml:space="preserve">        </w:t>
+      </w:r>
+      <w:proofErr w:type="gramStart"/>
+      <w:r>
+        <w:t>limit?:</w:t>
+      </w:r>
+      <w:proofErr w:type="gramEnd"/>
+      <w:r>
+        <w:t xml:space="preserve"> number;</w:t>
+      </w:r>
+      <w:r>
+        <w:br/>
+        <w:t xml:space="preserve">        </w:t>
+      </w:r>
+      <w:proofErr w:type="gramStart"/>
+      <w:r>
+        <w:t>category?:</w:t>
+      </w:r>
+      <w:proofErr w:type="gramEnd"/>
+      <w:r>
+        <w:t xml:space="preserve"> string;</w:t>
+      </w:r>
+      <w:r>
+        <w:br/>
+        <w:t xml:space="preserve">        </w:t>
+      </w:r>
+      <w:proofErr w:type="gramStart"/>
+      <w:r>
+        <w:t>status?:</w:t>
+      </w:r>
+      <w:proofErr w:type="gramEnd"/>
+      <w:r>
+        <w:t xml:space="preserve"> number;</w:t>
+      </w:r>
+      <w:r>
+        <w:br/>
+        <w:t xml:space="preserve">        vendor_</w:t>
+      </w:r>
+      <w:proofErr w:type="gramStart"/>
+      <w:r>
+        <w:t>id?:</w:t>
+      </w:r>
+      <w:proofErr w:type="gramEnd"/>
+      <w:r>
+        <w:t xml:space="preserve"> number;</w:t>
+      </w:r>
+      <w:r>
+        <w:br/>
+        <w:t xml:space="preserve">        </w:t>
+      </w:r>
+      <w:proofErr w:type="gramStart"/>
+      <w:r>
+        <w:t>search?:</w:t>
+      </w:r>
+      <w:proofErr w:type="gramEnd"/>
+      <w:r>
+        <w:t xml:space="preserve"> string;</w:t>
+      </w:r>
+      <w:r>
+        <w:br/>
+        <w:t xml:space="preserve">  </w:t>
+      </w:r>
+      <w:proofErr w:type="gramStart"/>
+      <w:r>
+        <w:t xml:space="preserve">  }</w:t>
+      </w:r>
+      <w:proofErr w:type="gramEnd"/>
+      <w:r>
+        <w:t>) =&gt; {</w:t>
       </w:r>
       <w:r>
         <w:br/>
@@ -1177,7 +1519,21 @@
         <w:rPr>
           <w:color w:val="4472C4" w:themeColor="accent1"/>
         </w:rPr>
-        <w:t>Next, we will update the ownership page imports and replace its direct fetch() calls with ownershipApi.summary() and ownershipApi.list().</w:t>
+        <w:t xml:space="preserve">Next, we will update the ownership page imports and replace its direct </w:t>
+      </w:r>
+      <w:proofErr w:type="gramStart"/>
+      <w:r>
+        <w:rPr>
+          <w:color w:val="4472C4" w:themeColor="accent1"/>
+        </w:rPr>
+        <w:t>fetch(</w:t>
+      </w:r>
+      <w:proofErr w:type="gramEnd"/>
+      <w:r>
+        <w:rPr>
+          <w:color w:val="4472C4" w:themeColor="accent1"/>
+        </w:rPr>
+        <w:t>) calls with ownershipApi.summary() and ownershipApi.list().</w:t>
       </w:r>
     </w:p>
     <w:p/>
@@ -1200,7 +1556,7 @@
                     <pic:cNvPicPr/>
                   </pic:nvPicPr>
                   <pic:blipFill>
-                    <a:blip r:embed="rId7"/>
+                    <a:blip r:embed="rId6"/>
                     <a:stretch>
                       <a:fillRect/>
                     </a:stretch>
@@ -1239,22 +1595,54 @@
     </w:p>
     <w:p>
       <w:r>
-        <w:t xml:space="preserve">    COUNT(*) FILTER (WHERE owst_category = 1 AND status = 1) AS user_ownership,</w:t>
-      </w:r>
-    </w:p>
-    <w:p>
-      <w:r>
-        <w:t xml:space="preserve">    COUNT(*) FILTER (WHERE owst_category = 2 AND status = 1) AS vendor_ownership,</w:t>
-      </w:r>
-    </w:p>
-    <w:p>
-      <w:r>
-        <w:t xml:space="preserve">    COUNT(*) FILTER (WHERE owst_category IN (1, 2) AND status = 1) AS total_ownership</w:t>
-      </w:r>
-    </w:p>
-    <w:p>
-      <w:r>
-        <w:t>FROM public.ownership_transfers;</w:t>
+        <w:t xml:space="preserve">    </w:t>
+      </w:r>
+      <w:proofErr w:type="gramStart"/>
+      <w:r>
+        <w:t>COUNT(</w:t>
+      </w:r>
+      <w:proofErr w:type="gramEnd"/>
+      <w:r>
+        <w:t>*) FILTER (WHERE owst_category = 1 AND status = 1) AS user_ownership,</w:t>
+      </w:r>
+    </w:p>
+    <w:p>
+      <w:r>
+        <w:t xml:space="preserve">    </w:t>
+      </w:r>
+      <w:proofErr w:type="gramStart"/>
+      <w:r>
+        <w:t>COUNT(</w:t>
+      </w:r>
+      <w:proofErr w:type="gramEnd"/>
+      <w:r>
+        <w:t>*) FILTER (WHERE owst_category = 2 AND status = 1) AS vendor_ownership,</w:t>
+      </w:r>
+    </w:p>
+    <w:p>
+      <w:r>
+        <w:t xml:space="preserve">    </w:t>
+      </w:r>
+      <w:proofErr w:type="gramStart"/>
+      <w:r>
+        <w:t>COUNT(</w:t>
+      </w:r>
+      <w:proofErr w:type="gramEnd"/>
+      <w:r>
+        <w:t>*) FILTER (WHERE owst_category IN (1, 2) AND status = 1) AS total_ownership</w:t>
+      </w:r>
+    </w:p>
+    <w:p>
+      <w:r>
+        <w:t xml:space="preserve">FROM </w:t>
+      </w:r>
+      <w:proofErr w:type="gramStart"/>
+      <w:r>
+        <w:t>public.ownership</w:t>
+      </w:r>
+      <w:proofErr w:type="gramEnd"/>
+      <w:r>
+        <w:t>_transfers;</w:t>
       </w:r>
     </w:p>
     <w:p/>
@@ -1276,7 +1664,7 @@
                     <pic:cNvPicPr/>
                   </pic:nvPicPr>
                   <pic:blipFill>
-                    <a:blip r:embed="rId8"/>
+                    <a:blip r:embed="rId7"/>
                     <a:stretch>
                       <a:fillRect/>
                     </a:stretch>
@@ -1323,8 +1711,13 @@
     </w:p>
     <w:p>
       <w:r>
-        <w:t>FROM information_schema.columns</w:t>
-      </w:r>
+        <w:t>FROM information_</w:t>
+      </w:r>
+      <w:proofErr w:type="gramStart"/>
+      <w:r>
+        <w:t>schema.columns</w:t>
+      </w:r>
+      <w:proofErr w:type="gramEnd"/>
     </w:p>
     <w:p>
       <w:r>
@@ -1361,7 +1754,7 @@
                     <pic:cNvPicPr/>
                   </pic:nvPicPr>
                   <pic:blipFill>
-                    <a:blip r:embed="rId9"/>
+                    <a:blip r:embed="rId8"/>
                     <a:stretch>
                       <a:fillRect/>
                     </a:stretch>
@@ -1385,6 +1778,403 @@
     <w:p/>
     <w:p/>
     <w:p/>
+    <w:p/>
+    <w:p/>
+    <w:p/>
+    <w:p/>
+    <w:p/>
+    <w:p>
+      <w:r>
+        <w:t>WITH ownership_rows AS (</w:t>
+      </w:r>
+    </w:p>
+    <w:p>
+      <w:r>
+        <w:t xml:space="preserve">    SELECT</w:t>
+      </w:r>
+    </w:p>
+    <w:p>
+      <w:r>
+        <w:t xml:space="preserve">        ot.id,</w:t>
+      </w:r>
+    </w:p>
+    <w:p>
+      <w:r>
+        <w:t xml:space="preserve">        </w:t>
+      </w:r>
+      <w:proofErr w:type="gramStart"/>
+      <w:r>
+        <w:t>ot.owst</w:t>
+      </w:r>
+      <w:proofErr w:type="gramEnd"/>
+      <w:r>
+        <w:t>_category,</w:t>
+      </w:r>
+    </w:p>
+    <w:p>
+      <w:r>
+        <w:t xml:space="preserve">        </w:t>
+      </w:r>
+      <w:proofErr w:type="gramStart"/>
+      <w:r>
+        <w:t>ot.device</w:t>
+      </w:r>
+      <w:proofErr w:type="gramEnd"/>
+      <w:r>
+        <w:t>_sl_no,</w:t>
+      </w:r>
+    </w:p>
+    <w:p>
+      <w:r>
+        <w:t xml:space="preserve">        </w:t>
+      </w:r>
+      <w:proofErr w:type="gramStart"/>
+      <w:r>
+        <w:t>UPPER(</w:t>
+      </w:r>
+      <w:proofErr w:type="gramEnd"/>
+    </w:p>
+    <w:p>
+      <w:r>
+        <w:t xml:space="preserve">            REGEXP_</w:t>
+      </w:r>
+      <w:proofErr w:type="gramStart"/>
+      <w:r>
+        <w:t>REPLACE(</w:t>
+      </w:r>
+      <w:proofErr w:type="gramEnd"/>
+    </w:p>
+    <w:p>
+      <w:r>
+        <w:t xml:space="preserve">                </w:t>
+      </w:r>
+      <w:proofErr w:type="gramStart"/>
+      <w:r>
+        <w:t>BTRIM(ot.device</w:t>
+      </w:r>
+      <w:proofErr w:type="gramEnd"/>
+      <w:r>
+        <w:t>_sl_no),</w:t>
+      </w:r>
+    </w:p>
+    <w:p>
+      <w:r>
+        <w:t xml:space="preserve">                '[^A-Za-z0-</w:t>
+      </w:r>
+      <w:proofErr w:type="gramStart"/>
+      <w:r>
+        <w:t>9]+</w:t>
+      </w:r>
+      <w:proofErr w:type="gramEnd"/>
+      <w:r>
+        <w:t>',</w:t>
+      </w:r>
+    </w:p>
+    <w:p>
+      <w:r>
+        <w:t xml:space="preserve">                '',</w:t>
+      </w:r>
+    </w:p>
+    <w:p>
+      <w:r>
+        <w:t xml:space="preserve">                'g'</w:t>
+      </w:r>
+    </w:p>
+    <w:p>
+      <w:r>
+        <w:t xml:space="preserve">            )</w:t>
+      </w:r>
+    </w:p>
+    <w:p>
+      <w:r>
+        <w:t xml:space="preserve">        ) AS serial_key</w:t>
+      </w:r>
+    </w:p>
+    <w:p>
+      <w:r>
+        <w:t xml:space="preserve">    FROM </w:t>
+      </w:r>
+      <w:proofErr w:type="gramStart"/>
+      <w:r>
+        <w:t>public.ownership</w:t>
+      </w:r>
+      <w:proofErr w:type="gramEnd"/>
+      <w:r>
+        <w:t>_transfers ot</w:t>
+      </w:r>
+    </w:p>
+    <w:p>
+      <w:r>
+        <w:t xml:space="preserve">    WHERE </w:t>
+      </w:r>
+      <w:proofErr w:type="gramStart"/>
+      <w:r>
+        <w:t>ot.status</w:t>
+      </w:r>
+      <w:proofErr w:type="gramEnd"/>
+      <w:r>
+        <w:t xml:space="preserve"> = 1</w:t>
+      </w:r>
+    </w:p>
+    <w:p>
+      <w:r>
+        <w:t xml:space="preserve">      AND </w:t>
+      </w:r>
+      <w:proofErr w:type="gramStart"/>
+      <w:r>
+        <w:t>ot.owst</w:t>
+      </w:r>
+      <w:proofErr w:type="gramEnd"/>
+      <w:r>
+        <w:t>_category IN (1, 2)</w:t>
+      </w:r>
+    </w:p>
+    <w:p>
+      <w:r>
+        <w:t xml:space="preserve">      AND NULLIF(</w:t>
+      </w:r>
+      <w:proofErr w:type="gramStart"/>
+      <w:r>
+        <w:t>BTRIM(ot.device</w:t>
+      </w:r>
+      <w:proofErr w:type="gramEnd"/>
+      <w:r>
+        <w:t>_sl_no), '') IS NOT NULL</w:t>
+      </w:r>
+    </w:p>
+    <w:p>
+      <w:r>
+        <w:t>)</w:t>
+      </w:r>
+    </w:p>
+    <w:p/>
+    <w:p>
+      <w:r>
+        <w:t>SELECT</w:t>
+      </w:r>
+    </w:p>
+    <w:p>
+      <w:r>
+        <w:t xml:space="preserve">    CASE ownership_</w:t>
+      </w:r>
+      <w:proofErr w:type="gramStart"/>
+      <w:r>
+        <w:t>rows.owst</w:t>
+      </w:r>
+      <w:proofErr w:type="gramEnd"/>
+      <w:r>
+        <w:t>_category</w:t>
+      </w:r>
+    </w:p>
+    <w:p>
+      <w:r>
+        <w:t xml:space="preserve">        WHEN 1 THEN 'User Ownership'</w:t>
+      </w:r>
+    </w:p>
+    <w:p>
+      <w:r>
+        <w:t xml:space="preserve">        WHEN 2 THEN 'Vendor Ownership'</w:t>
+      </w:r>
+    </w:p>
+    <w:p>
+      <w:r>
+        <w:lastRenderedPageBreak/>
+        <w:t xml:space="preserve">    END AS ownership_type,</w:t>
+      </w:r>
+    </w:p>
+    <w:p/>
+    <w:p>
+      <w:r>
+        <w:t xml:space="preserve">    </w:t>
+      </w:r>
+      <w:proofErr w:type="gramStart"/>
+      <w:r>
+        <w:t>COUNT(</w:t>
+      </w:r>
+      <w:proofErr w:type="gramEnd"/>
+      <w:r>
+        <w:t>*) AS transfer_forms,</w:t>
+      </w:r>
+    </w:p>
+    <w:p/>
+    <w:p>
+      <w:r>
+        <w:t xml:space="preserve">    </w:t>
+      </w:r>
+      <w:proofErr w:type="gramStart"/>
+      <w:r>
+        <w:t>COUNT(</w:t>
+      </w:r>
+      <w:proofErr w:type="gramEnd"/>
+      <w:r>
+        <w:t>ad.id) AS matched_current_assets,</w:t>
+      </w:r>
+    </w:p>
+    <w:p/>
+    <w:p>
+      <w:r>
+        <w:t xml:space="preserve">    </w:t>
+      </w:r>
+      <w:proofErr w:type="gramStart"/>
+      <w:r>
+        <w:t>COUNT(</w:t>
+      </w:r>
+      <w:proofErr w:type="gramEnd"/>
+      <w:r>
+        <w:t xml:space="preserve">*) - </w:t>
+      </w:r>
+      <w:proofErr w:type="gramStart"/>
+      <w:r>
+        <w:t>COUNT(</w:t>
+      </w:r>
+      <w:proofErr w:type="gramEnd"/>
+      <w:r>
+        <w:t>ad.id) AS transfer_only_records</w:t>
+      </w:r>
+    </w:p>
+    <w:p/>
+    <w:p>
+      <w:r>
+        <w:t>FROM ownership_rows</w:t>
+      </w:r>
+    </w:p>
+    <w:p>
+      <w:r>
+        <w:t xml:space="preserve">LEFT JOIN </w:t>
+      </w:r>
+      <w:proofErr w:type="gramStart"/>
+      <w:r>
+        <w:t>public.asset</w:t>
+      </w:r>
+      <w:proofErr w:type="gramEnd"/>
+      <w:r>
+        <w:t>_devices ad</w:t>
+      </w:r>
+    </w:p>
+    <w:p>
+      <w:r>
+        <w:t xml:space="preserve">    ON </w:t>
+      </w:r>
+      <w:proofErr w:type="gramStart"/>
+      <w:r>
+        <w:t>ad.device</w:t>
+      </w:r>
+      <w:proofErr w:type="gramEnd"/>
+      <w:r>
+        <w:t>_serial_key = ownership_</w:t>
+      </w:r>
+      <w:proofErr w:type="gramStart"/>
+      <w:r>
+        <w:t>rows.serial</w:t>
+      </w:r>
+      <w:proofErr w:type="gramEnd"/>
+      <w:r>
+        <w:t>_key</w:t>
+      </w:r>
+    </w:p>
+    <w:p>
+      <w:r>
+        <w:t xml:space="preserve">   AND ad.row_status = 1</w:t>
+      </w:r>
+    </w:p>
+    <w:p/>
+    <w:p>
+      <w:r>
+        <w:t>GROUP BY ownership_</w:t>
+      </w:r>
+      <w:proofErr w:type="gramStart"/>
+      <w:r>
+        <w:t>rows.owst</w:t>
+      </w:r>
+      <w:proofErr w:type="gramEnd"/>
+      <w:r>
+        <w:t>_category</w:t>
+      </w:r>
+    </w:p>
+    <w:p>
+      <w:r>
+        <w:t>ORDER BY ownership_</w:t>
+      </w:r>
+      <w:proofErr w:type="gramStart"/>
+      <w:r>
+        <w:t>rows.owst</w:t>
+      </w:r>
+      <w:proofErr w:type="gramEnd"/>
+      <w:r>
+        <w:t>_category;</w:t>
+      </w:r>
+    </w:p>
+    <w:p/>
+    <w:p/>
+    <w:p/>
+    <w:p>
+      <w:r>
+        <w:lastRenderedPageBreak/>
+        <w:drawing>
+          <wp:inline distT="0" distB="0" distL="0" distR="0" wp14:anchorId="54666C18" wp14:editId="5B55DB45">
+            <wp:extent cx="5943600" cy="3178175"/>
+            <wp:effectExtent l="0" t="0" r="0" b="3175"/>
+            <wp:docPr id="353821221" name="Picture 1"/>
+            <wp:cNvGraphicFramePr>
+              <a:graphicFrameLocks xmlns:a="http://schemas.openxmlformats.org/drawingml/2006/main" noChangeAspect="1"/>
+            </wp:cNvGraphicFramePr>
+            <a:graphic xmlns:a="http://schemas.openxmlformats.org/drawingml/2006/main">
+              <a:graphicData uri="http://schemas.openxmlformats.org/drawingml/2006/picture">
+                <pic:pic xmlns:pic="http://schemas.openxmlformats.org/drawingml/2006/picture">
+                  <pic:nvPicPr>
+                    <pic:cNvPr id="353821221" name=""/>
+                    <pic:cNvPicPr/>
+                  </pic:nvPicPr>
+                  <pic:blipFill>
+                    <a:blip r:embed="rId9"/>
+                    <a:stretch>
+                      <a:fillRect/>
+                    </a:stretch>
+                  </pic:blipFill>
+                  <pic:spPr>
+                    <a:xfrm>
+                      <a:off x="0" y="0"/>
+                      <a:ext cx="5943600" cy="3178175"/>
+                    </a:xfrm>
+                    <a:prstGeom prst="rect">
+                      <a:avLst/>
+                    </a:prstGeom>
+                  </pic:spPr>
+                </pic:pic>
+              </a:graphicData>
+            </a:graphic>
+          </wp:inline>
+        </w:drawing>
+      </w:r>
+    </w:p>
+    <w:p/>
+    <w:p/>
+    <w:p>
+      <w:r>
+        <w:t>After these changes:</w:t>
+      </w:r>
+    </w:p>
+    <w:p>
+      <w:r>
+        <w:t>10 records per API page</w:t>
+      </w:r>
+      <w:r>
+        <w:br/>
+        <w:t>10 visible rows in the screen</w:t>
+      </w:r>
+      <w:r>
+        <w:br/>
+        <w:t>Smaller but readable table rows</w:t>
+      </w:r>
+      <w:r>
+        <w:br/>
+        <w:t>Cleaner, professional search field</w:t>
+      </w:r>
+      <w:r>
+        <w:br/>
+        <w:t>Less wasted toolbar space</w:t>
+      </w:r>
+    </w:p>
     <w:p/>
     <w:sectPr>
       <w:pgSz w:w="12240" w:h="15840"/>

</xml_diff>